<commit_message>
Add managed-API apex tier to the Chapter 10 reusability hierarchy figure
The Reusability Hierarchy pyramid gains a sixth tier above Full Models for
managed end-to-end recommendation services, the buy-not-build extreme of
reuse. The figure was regenerated from the PowerPoint source and the five
existing tiers were re-spaced to fit six without colliding with the slide
title or footer.

Also replaces the FIGURE 1 caption, which still held an unused
image-generation brief, with a real reader-facing caption, and revises the
surrounding prose so Full Models is described as near the top of the
hierarchy rather than at it, with a short passage on reusing an entire
managed recommendation service.

Co-authored-by: Cursor <cursoragent@cursor.com>
</commit_message>
<xml_diff>
--- a/chapters/Chapter 10/Chapter 10 - Item Embeddings.docx
+++ b/chapters/Chapter 10/Chapter 10 - Item Embeddings.docx
@@ -171,15 +171,15 @@
     </w:p>
     <w:p>
       <w:r>
-        <w:t xml:space="preserve">At the top of the hierarchy, some organizations go as far as reusing entire models. Netflix’s recent "foundation model" for recommendations attempts to train a single large model </w:t>
+        <w:t xml:space="preserve">Near the top of the hierarchy, some organizations go as far as reusing entire models. Netflix’s recent "foundation model" for recommendations attempts to train a single large model </w:t>
       </w:r>
       <w:r>
         <w:lastRenderedPageBreak/>
-        <w:t xml:space="preserve">whose embeddings and weights can be shared or fine-tuned across all recommendation surfaces. This mirrors the trajectory of NLP, where one large language model now performs tasks that once required many specialized models. Not every company has the resources to pursue this approach of a single unified model. But even medium-sized enterprises can benefit from the lower levels of the </w:t>
+        <w:t xml:space="preserve">whose embeddings and weights can be shared or fine-tuned across all recommendation surfaces. This mirrors the trajectory of NLP, where one large language model now performs tasks that once required many specialized models. Not every company has the resources to pursue this approach of a single unified model. At the very apex sits a different kind of reuse: subscribing to a managed recommendation API such as Amazon Personalize, Google Recommendations AI, or Vertex AI Search, and consuming someone else’s recommender end to end rather than any component of your own. This is the most heavily packaged option on the hierarchy, since the vendor owns the data pipeline, the model, the retraining schedule, and the serving infrastructure, and it is also the least differentiating, because the resulting experience reflects the vendor’s design choices rather than anything proprietary to the business. For an organization large enough to need the rest of this book, that trade is usually the wrong one, and the apex is correspondingly the narrowest and least occupied tier in the figure. But even medium-sized enterprises can benefit from the lower levels of the </w:t>
       </w:r>
       <w:proofErr w:type="gramStart"/>
       <w:r>
-        <w:t>hierarchy—</w:t>
+        <w:t xml:space="preserve">hierarchy, </w:t>
       </w:r>
       <w:proofErr w:type="gramEnd"/>
       <w:r>
@@ -237,7 +237,7 @@
           <w:i/>
           <w:color w:val="808080"/>
         </w:rPr>
-        <w:t>FIGURE 1: Diagram showing the Reusability Hierarchy as a pyramid: Ideas &amp; Patterns (bottom, most abstract but also more prevalent) → Data &amp; Features → Code &amp; Libraries → Embeddings &amp; Representations → Full Models (top, most rare). Highlight the Embeddings layer as the focus of Chapters 10–11.</w:t>
+        <w:t>FIGURE 1: The Reusability Hierarchy. Each tier is a type of artifact an organization can share across its recommendation surfaces, rising from ideas and design patterns at the base, through data and feature pipelines, code and libraries, embeddings and representations, and full models, to a managed recommendation API at the apex. The tiers narrow toward the top because the artifacts become rarer and more heavily packaged, not because they matter more. Embeddings and representations, the focus of Chapters 10 and 11, are highlighted.</w:t>
       </w:r>
     </w:p>
     <w:p>

</xml_diff>